<commit_message>
paper: backfill Zenodo DOI 10.5281/zenodo.22156943 into Sec 6 + ref 21 (zh/en md, docx, HTML)
</commit_message>
<xml_diff>
--- a/paper/LKina_manuscript_CN_submission.docx
+++ b/paper/LKina_manuscript_CN_submission.docx
@@ -26830,10 +26830,28 @@
         <w:rPr>
           <w:rFonts w:hint="eastAsia"/>
         </w:rPr>
-        <w:t xml:space="preserve">以便精确复现。出版时将注册</w:t>
-      </w:r>
-      <w:r>
-        <w:t xml:space="preserve"> Zenodo DOI </w:t>
+        <w:t xml:space="preserve">以便精确复现。v1.0.2</w:t>
+      </w:r>
+      <w:r>
+        <w:t xml:space="preserve"> </w:t>
+      </w:r>
+      <w:r>
+        <w:rPr>
+          <w:rFonts w:hint="eastAsia"/>
+        </w:rPr>
+        <w:t xml:space="preserve">快照已存档于</w:t>
+      </w:r>
+      <w:r>
+        <w:t xml:space="preserve"> </w:t>
+      </w:r>
+      <w:r>
+        <w:rPr>
+          <w:rFonts w:hint="eastAsia"/>
+        </w:rPr>
+        <w:t xml:space="preserve">Zenodo：https://doi.org/10.5281/zenodo.22156943</w:t>
+      </w:r>
+      <w:r>
+        <w:t xml:space="preserve"> </w:t>
       </w:r>
       <w:r>
         <w:rPr>
@@ -27704,7 +27722,7 @@
         </w:numPr>
       </w:pPr>
       <w:r>
-        <w:t xml:space="preserve">European Organization for Nuclear Research &amp; OpenAIRE. Zenodo. https://zenodo.org/. doi:10.25495/7gxk-rd71</w:t>
+        <w:t xml:space="preserve">LK-Studio1128. LKina: A Metal-Aware and Covalent-Reactive Molecular Docking Engine Extending AutoDock Vina. Version v1.0.2. Zenodo, 2026. https://doi.org/10.5281/zenodo.22156943</w:t>
       </w:r>
     </w:p>
     <w:p>

</xml_diff>

<commit_message>
paper: comprehensive review fixes (sec 2.4 Table 2 nbp params, EN em-dash repair, 5-mode note, _120.json clarification, SIGABRT scope, README 4JC sync) + figures 600 dpi PNG/PDF/TIF
</commit_message>
<xml_diff>
--- a/paper/LKina_manuscript_CN_submission.docx
+++ b/paper/LKina_manuscript_CN_submission.docx
@@ -5228,7 +5228,16 @@
         <w:rPr>
           <w:rFonts w:hint="eastAsia"/>
         </w:rPr>
-        <w:t xml:space="preserve">四类配位伪原子的几何与势阱参数。</w:t>
+        <w:t xml:space="preserve">四类配位伪原子的几何与配位作用参数（nbp</w:t>
+      </w:r>
+      <w:r>
+        <w:t xml:space="preserve"> </w:t>
+      </w:r>
+      <w:r>
+        <w:rPr>
+          <w:rFonts w:hint="eastAsia"/>
+        </w:rPr>
+        <w:t xml:space="preserve">覆盖）。</w:t>
       </w:r>
     </w:p>
     <w:tbl>
@@ -5312,6 +5321,12 @@
             <w:pPr>
               <w:pStyle w:val="Compact"/>
             </w:pPr>
+            <w:r>
+              <w:t xml:space="preserve">nbp</w:t>
+            </w:r>
+            <w:r>
+              <w:t xml:space="preserve"> </w:t>
+            </w:r>
             <m:oMath>
               <m:sSub>
                 <m:e>
@@ -5344,6 +5359,12 @@
             <w:pPr>
               <w:pStyle w:val="Compact"/>
             </w:pPr>
+            <w:r>
+              <w:t xml:space="preserve">nbp</w:t>
+            </w:r>
+            <w:r>
+              <w:t xml:space="preserve"> </w:t>
+            </w:r>
             <m:oMath>
               <m:r>
                 <m:t>ε</m:t>
@@ -5353,7 +5374,13 @@
               <w:t xml:space="preserve"> </w:t>
             </w:r>
             <w:r>
-              <w:t xml:space="preserve">(kcal/mol)</w:t>
+              <w:rPr>
+                <w:rFonts w:hint="eastAsia"/>
+              </w:rPr>
+              <w:t xml:space="preserve">范围</w:t>
+            </w:r>
+            <w:r>
+              <w:t xml:space="preserve"> (kcal/mol)</w:t>
             </w:r>
           </w:p>
         </w:tc>
@@ -5440,7 +5467,7 @@
               <w:pStyle w:val="Compact"/>
             </w:pPr>
             <w:r>
-              <w:t xml:space="preserve">2.5</w:t>
+              <w:t xml:space="preserve">3.0–23.2</w:t>
             </w:r>
           </w:p>
         </w:tc>
@@ -5518,7 +5545,7 @@
               <w:pStyle w:val="Compact"/>
             </w:pPr>
             <w:r>
-              <w:t xml:space="preserve">2.5</w:t>
+              <w:t xml:space="preserve">3.0–24.0</w:t>
             </w:r>
           </w:p>
         </w:tc>
@@ -5599,7 +5626,7 @@
               <w:pStyle w:val="Compact"/>
             </w:pPr>
             <w:r>
-              <w:t xml:space="preserve">2.5</w:t>
+              <w:t xml:space="preserve">0.2–14.0</w:t>
             </w:r>
           </w:p>
         </w:tc>
@@ -5683,7 +5710,7 @@
               <w:pStyle w:val="Compact"/>
             </w:pPr>
             <w:r>
-              <w:t xml:space="preserve">2.5</w:t>
+              <w:t xml:space="preserve">2.5–15.0</w:t>
             </w:r>
           </w:p>
         </w:tc>
@@ -5756,26 +5783,18 @@
               <w:pStyle w:val="Compact"/>
             </w:pPr>
             <w:r>
-              <w:rPr>
-                <w:b/>
-                <w:bCs/>
-              </w:rPr>
-              <w:t xml:space="preserve">0.45</w:t>
-            </w:r>
-          </w:p>
-        </w:tc>
-        <w:tc>
-          <w:tcPr/>
-          <w:p>
-            <w:pPr>
-              <w:pStyle w:val="Compact"/>
-            </w:pPr>
-            <w:r>
-              <w:rPr>
-                <w:b/>
-                <w:bCs/>
-              </w:rPr>
-              <w:t xml:space="preserve">1.8</w:t>
+              <w:t xml:space="preserve">0.25</w:t>
+            </w:r>
+          </w:p>
+        </w:tc>
+        <w:tc>
+          <w:tcPr/>
+          <w:p>
+            <w:pPr>
+              <w:pStyle w:val="Compact"/>
+            </w:pPr>
+            <w:r>
+              <w:t xml:space="preserve">0.2–5.0</w:t>
             </w:r>
           </w:p>
         </w:tc>
@@ -5786,13 +5805,122 @@
         <w:pStyle w:val="BodyText"/>
       </w:pPr>
       <w:r>
-        <w:t xml:space="preserve">JT </w:t>
-      </w:r>
-      <w:r>
-        <w:rPr>
-          <w:rFonts w:hint="eastAsia"/>
-        </w:rPr>
-        <w:t xml:space="preserve">轴向伪原子采用更大的</w:t>
+        <w:rPr>
+          <w:rFonts w:hint="eastAsia"/>
+        </w:rPr>
+        <w:t xml:space="preserve">伪原子自身不携带</w:t>
+      </w:r>
+      <w:r>
+        <w:t xml:space="preserve"> vdW </w:t>
+      </w:r>
+      <w:r>
+        <w:rPr>
+          <w:rFonts w:hint="eastAsia"/>
+        </w:rPr>
+        <w:t xml:space="preserve">作用（官方</w:t>
+      </w:r>
+      <w:r>
+        <w:t xml:space="preserve"> AD4Zn </w:t>
+      </w:r>
+      <w:r>
+        <w:rPr>
+          <w:rFonts w:hint="eastAsia"/>
+        </w:rPr>
+        <w:t xml:space="preserve">中性参数</w:t>
+      </w:r>
+      <w:r>
+        <w:t xml:space="preserve"> </w:t>
+      </w:r>
+      <m:oMath>
+        <m:sSub>
+          <m:e>
+            <m:r>
+              <m:t>R</m:t>
+            </m:r>
+          </m:e>
+          <m:sub>
+            <m:r>
+              <m:t>i</m:t>
+            </m:r>
+            <m:r>
+              <m:t>i</m:t>
+            </m:r>
+          </m:sub>
+        </m:sSub>
+        <m:r>
+          <m:rPr>
+            <m:sty m:val="p"/>
+          </m:rPr>
+          <m:t>=</m:t>
+        </m:r>
+        <m:r>
+          <m:t>1.0</m:t>
+        </m:r>
+      </m:oMath>
+      <w:r>
+        <w:t xml:space="preserve"> </w:t>
+      </w:r>
+      <w:r>
+        <w:t xml:space="preserve">Å、</w:t>
+      </w:r>
+      <m:oMath>
+        <m:sSub>
+          <m:e>
+            <m:r>
+              <m:t>ε</m:t>
+            </m:r>
+          </m:e>
+          <m:sub>
+            <m:r>
+              <m:t>i</m:t>
+            </m:r>
+            <m:r>
+              <m:t>i</m:t>
+            </m:r>
+          </m:sub>
+        </m:sSub>
+        <m:r>
+          <m:rPr>
+            <m:sty m:val="p"/>
+          </m:rPr>
+          <m:t>=</m:t>
+        </m:r>
+        <m:r>
+          <m:t>0.0</m:t>
+        </m:r>
+      </m:oMath>
+      <w:r>
+        <w:rPr>
+          <w:rFonts w:hint="eastAsia"/>
+        </w:rPr>
+        <w:t xml:space="preserve">；见</w:t>
+      </w:r>
+      <w:r>
+        <w:t xml:space="preserve"> </w:t>
+      </w:r>
+      <w:r>
+        <w:rPr>
+          <w:rFonts w:hint="eastAsia"/>
+        </w:rPr>
+        <w:t xml:space="preserve">§3.2.1），全部配位相互作用经显式</w:t>
+      </w:r>
+      <w:r>
+        <w:t xml:space="preserve"> </w:t>
+      </w:r>
+      <w:r>
+        <w:rPr>
+          <w:rStyle w:val="VerbatimChar"/>
+        </w:rPr>
+        <w:t xml:space="preserve">nbp_r_eps</w:t>
+      </w:r>
+      <w:r>
+        <w:t xml:space="preserve"> </w:t>
+      </w:r>
+      <w:r>
+        <w:rPr>
+          <w:rFonts w:hint="eastAsia"/>
+        </w:rPr>
+        <w:t xml:space="preserve">覆盖编码进格点：覆盖的</w:t>
       </w:r>
       <w:r>
         <w:t xml:space="preserve"> </w:t>
@@ -5814,18 +5942,27 @@
             </m:r>
           </m:sub>
         </m:sSub>
+        <m:r>
+          <m:rPr>
+            <m:sty m:val="p"/>
+          </m:rPr>
+          <m:t>=</m:t>
+        </m:r>
+        <m:r>
+          <m:t>0.25</m:t>
+        </m:r>
       </m:oMath>
       <w:r>
         <w:t xml:space="preserve"> </w:t>
       </w:r>
       <w:r>
-        <w:rPr>
-          <w:rFonts w:hint="eastAsia"/>
-        </w:rPr>
-        <w:t xml:space="preserve">与更弱的</w:t>
-      </w:r>
-      <w:r>
-        <w:t xml:space="preserve"> </w:t>
+        <w:t xml:space="preserve">Å </w:t>
+      </w:r>
+      <w:r>
+        <w:rPr>
+          <w:rFonts w:hint="eastAsia"/>
+        </w:rPr>
+        <w:t xml:space="preserve">使配体供体探针直接落在伪原子位点，</w:t>
       </w:r>
       <m:oMath>
         <m:r>
@@ -5833,10 +5970,180 @@
         </m:r>
       </m:oMath>
       <w:r>
-        <w:rPr>
-          <w:rFonts w:hint="eastAsia"/>
-        </w:rPr>
-        <w:t xml:space="preserve">，以镜像</w:t>
+        <w:t xml:space="preserve"> </w:t>
+      </w:r>
+      <w:r>
+        <w:rPr>
+          <w:rFonts w:hint="eastAsia"/>
+        </w:rPr>
+        <w:t xml:space="preserve">按金属-供体</w:t>
+      </w:r>
+      <w:r>
+        <w:t xml:space="preserve"> HSAB </w:t>
+      </w:r>
+      <w:r>
+        <w:rPr>
+          <w:rFonts w:hint="eastAsia"/>
+        </w:rPr>
+        <w:t xml:space="preserve">匹配在</w:t>
+      </w:r>
+      <w:r>
+        <w:t xml:space="preserve"> 0.2–24 kcal/mol </w:t>
+      </w:r>
+      <w:r>
+        <w:rPr>
+          <w:rFonts w:hint="eastAsia"/>
+        </w:rPr>
+        <w:t xml:space="preserve">间取值（未加权表值；经</w:t>
+      </w:r>
+      <w:r>
+        <w:t xml:space="preserve"> AD4</w:t>
+      </w:r>
+      <w:r>
+        <w:t xml:space="preserve"> </w:t>
+      </w:r>
+      <w:r>
+        <w:rPr>
+          <w:rStyle w:val="VerbatimChar"/>
+        </w:rPr>
+        <w:t xml:space="preserve">coeff_vdW</w:t>
+      </w:r>
+      <w:r>
+        <w:t xml:space="preserve"> </w:t>
+      </w:r>
+      <w:r>
+        <w:rPr>
+          <w:rFonts w:hint="eastAsia"/>
+        </w:rPr>
+        <w:t xml:space="preserve">加权后的实际势井深度见</w:t>
+      </w:r>
+      <w:r>
+        <w:t xml:space="preserve"> </w:t>
+      </w:r>
+      <w:r>
+        <w:rPr>
+          <w:rFonts w:hint="eastAsia"/>
+        </w:rPr>
+        <w:t xml:space="preserve">§3.2.1，如</w:t>
+      </w:r>
+      <w:r>
+        <w:t xml:space="preserve"> Zn–NA/TZ </w:t>
+      </w:r>
+      <w:r>
+        <w:rPr>
+          <w:rFonts w:hint="eastAsia"/>
+        </w:rPr>
+        <w:t xml:space="preserve">表值</w:t>
+      </w:r>
+      <w:r>
+        <w:t xml:space="preserve"> 23.2135 → </w:t>
+      </w:r>
+      <w:r>
+        <w:rPr>
+          <w:rFonts w:hint="eastAsia"/>
+        </w:rPr>
+        <w:t xml:space="preserve">加权</w:t>
+      </w:r>
+      <w:r>
+        <w:t xml:space="preserve"> −3.86 </w:t>
+      </w:r>
+      <w:r>
+        <w:rPr>
+          <w:rFonts w:hint="eastAsia"/>
+        </w:rPr>
+        <w:t xml:space="preserve">kcal/mol）。JT</w:t>
+      </w:r>
+      <w:r>
+        <w:t xml:space="preserve"> </w:t>
+      </w:r>
+      <w:r>
+        <w:rPr>
+          <w:rFonts w:hint="eastAsia"/>
+        </w:rPr>
+        <w:t xml:space="preserve">轴向与赤道共享</w:t>
+      </w:r>
+      <w:r>
+        <w:t xml:space="preserve"> </w:t>
+      </w:r>
+      <m:oMath>
+        <m:sSub>
+          <m:e>
+            <m:r>
+              <m:t>r</m:t>
+            </m:r>
+          </m:e>
+          <m:sub>
+            <m:r>
+              <m:rPr>
+                <m:nor/>
+                <m:sty m:val="p"/>
+              </m:rPr>
+              <m:t>eq</m:t>
+            </m:r>
+          </m:sub>
+        </m:sSub>
+        <m:r>
+          <m:rPr>
+            <m:sty m:val="p"/>
+          </m:rPr>
+          <m:t>=</m:t>
+        </m:r>
+        <m:r>
+          <m:t>0.25</m:t>
+        </m:r>
+      </m:oMath>
+      <w:r>
+        <w:t xml:space="preserve"> </w:t>
+      </w:r>
+      <w:r>
+        <w:rPr>
+          <w:rFonts w:hint="eastAsia"/>
+        </w:rPr>
+        <w:t xml:space="preserve">Å，但轴向伪原子的注入距离更远（cu2_jt</w:t>
+      </w:r>
+      <w:r>
+        <w:t xml:space="preserve"> 2.45 Å、mn3_jt 2.28 </w:t>
+      </w:r>
+      <w:r>
+        <w:rPr>
+          <w:rFonts w:hint="eastAsia"/>
+        </w:rPr>
+        <w:t xml:space="preserve">Å，赤道</w:t>
+      </w:r>
+      <w:r>
+        <w:t xml:space="preserve"> 2.03/1.92 </w:t>
+      </w:r>
+      <w:r>
+        <w:rPr>
+          <w:rFonts w:hint="eastAsia"/>
+        </w:rPr>
+        <w:t xml:space="preserve">Å）且覆盖</w:t>
+      </w:r>
+      <w:r>
+        <w:t xml:space="preserve"> </w:t>
+      </w:r>
+      <m:oMath>
+        <m:r>
+          <m:t>ε</m:t>
+        </m:r>
+      </m:oMath>
+      <w:r>
+        <w:t xml:space="preserve"> </w:t>
+      </w:r>
+      <w:r>
+        <w:rPr>
+          <w:rFonts w:hint="eastAsia"/>
+        </w:rPr>
+        <w:t xml:space="preserve">更弱（0.2–5.0</w:t>
+      </w:r>
+      <w:r>
+        <w:t xml:space="preserve"> vs 2.5–15.0 </w:t>
+      </w:r>
+      <w:r>
+        <w:rPr>
+          <w:rFonts w:hint="eastAsia"/>
+        </w:rPr>
+        <w:t xml:space="preserve">kcal/mol），以镜像</w:t>
       </w:r>
       <w:r>
         <w:t xml:space="preserve"> Jahn-Teller </w:t>
@@ -7690,83 +7997,43 @@
         <w:rPr>
           <w:rFonts w:hint="eastAsia"/>
         </w:rPr>
-        <w:t xml:space="preserve">轴向（</w:t>
-      </w:r>
-      <m:oMath>
-        <m:sSub>
-          <m:e>
-            <m:r>
-              <m:t>r</m:t>
-            </m:r>
-          </m:e>
-          <m:sub>
-            <m:r>
-              <m:rPr>
-                <m:nor/>
-                <m:sty m:val="p"/>
-              </m:rPr>
-              <m:t>eq</m:t>
-            </m:r>
-          </m:sub>
-        </m:sSub>
-        <m:r>
-          <m:rPr>
-            <m:sty m:val="p"/>
-          </m:rPr>
-          <m:t>=</m:t>
-        </m:r>
-        <m:r>
-          <m:t>0.45</m:t>
-        </m:r>
-      </m:oMath>
-      <w:r>
-        <w:t xml:space="preserve"> </w:t>
-      </w:r>
-      <w:r>
-        <w:rPr>
-          <w:rFonts w:hint="eastAsia"/>
-        </w:rPr>
-        <w:t xml:space="preserve">Å，</w:t>
-      </w:r>
-      <m:oMath>
-        <m:r>
-          <m:t>ε</m:t>
-        </m:r>
-        <m:r>
-          <m:rPr>
-            <m:sty m:val="p"/>
-          </m:rPr>
-          <m:t>=</m:t>
-        </m:r>
-        <m:r>
-          <m:t>1.8</m:t>
-        </m:r>
-      </m:oMath>
-      <w:r>
-        <w:rPr>
-          <w:rFonts w:hint="eastAsia"/>
-        </w:rPr>
-        <w:t xml:space="preserve">）与赤道（</w:t>
-      </w:r>
-      <m:oMath>
-        <m:r>
-          <m:t>ε</m:t>
-        </m:r>
-        <m:r>
-          <m:rPr>
-            <m:sty m:val="p"/>
-          </m:rPr>
-          <m:t>=</m:t>
-        </m:r>
-        <m:r>
-          <m:t>2.5</m:t>
-        </m:r>
-      </m:oMath>
-      <w:r>
-        <w:rPr>
-          <w:rFonts w:hint="eastAsia"/>
-        </w:rPr>
-        <w:t xml:space="preserve">）的差异化参数使搜索能够区分两个配位球，这对</w:t>
+        <w:t xml:space="preserve">轴向（注入距离</w:t>
+      </w:r>
+      <w:r>
+        <w:t xml:space="preserve"> cu2_jt 2.45 Å / mn3_jt 2.28 </w:t>
+      </w:r>
+      <w:r>
+        <w:rPr>
+          <w:rFonts w:hint="eastAsia"/>
+        </w:rPr>
+        <w:t xml:space="preserve">Å，nbp</w:t>
+      </w:r>
+      <w:r>
+        <w:t xml:space="preserve"> ε </w:t>
+      </w:r>
+      <w:r>
+        <w:rPr>
+          <w:rFonts w:hint="eastAsia"/>
+        </w:rPr>
+        <w:t xml:space="preserve">0.2–5.0）与赤道（注入</w:t>
+      </w:r>
+      <w:r>
+        <w:t xml:space="preserve"> 2.03/1.92 </w:t>
+      </w:r>
+      <w:r>
+        <w:rPr>
+          <w:rFonts w:hint="eastAsia"/>
+        </w:rPr>
+        <w:t xml:space="preserve">Å，ε</w:t>
+      </w:r>
+      <w:r>
+        <w:t xml:space="preserve"> </w:t>
+      </w:r>
+      <w:r>
+        <w:rPr>
+          <w:rFonts w:hint="eastAsia"/>
+        </w:rPr>
+        <w:t xml:space="preserve">2.5–15.0）的差异化参数使搜索能够区分两个配位球，这对</w:t>
       </w:r>
       <w:r>
         <w:t xml:space="preserve"> d⁹ Cu²⁺ </w:t>
@@ -12375,13 +12642,22 @@
         <w:t xml:space="preserve">在</w:t>
       </w:r>
       <w:r>
-        <w:t xml:space="preserve"> LKDock </w:t>
-      </w:r>
-      <w:r>
-        <w:rPr>
-          <w:rFonts w:hint="eastAsia"/>
-        </w:rPr>
-        <w:t xml:space="preserve">集成测试中，以</w:t>
+        <w:t xml:space="preserve"> LKDock GUI </w:t>
+      </w:r>
+      <w:r>
+        <w:rPr>
+          <w:rFonts w:hint="eastAsia"/>
+        </w:rPr>
+        <w:t xml:space="preserve">集成打包（PyInstaller</w:t>
+      </w:r>
+      <w:r>
+        <w:t xml:space="preserve"> </w:t>
+      </w:r>
+      <w:r>
+        <w:rPr>
+          <w:rFonts w:hint="eastAsia"/>
+        </w:rPr>
+        <w:t xml:space="preserve">等）测试中，以</w:t>
       </w:r>
       <w:r>
         <w:t xml:space="preserve"> </w:t>
@@ -12673,6 +12949,92 @@
       </w:r>
       <w:r>
         <w:t xml:space="preserve">。</w:t>
+      </w:r>
+      <w:r>
+        <w:rPr>
+          <w:rFonts w:hint="eastAsia"/>
+          <w:b/>
+          <w:bCs/>
+        </w:rPr>
+        <w:t xml:space="preserve">注</w:t>
+      </w:r>
+      <w:r>
+        <w:rPr>
+          <w:rFonts w:hint="eastAsia"/>
+        </w:rPr>
+        <w:t xml:space="preserve">：命令行直连</w:t>
+      </w:r>
+      <w:r>
+        <w:t xml:space="preserve"> LKina </w:t>
+      </w:r>
+      <w:r>
+        <w:rPr>
+          <w:rFonts w:hint="eastAsia"/>
+        </w:rPr>
+        <w:t xml:space="preserve">二进制使用</w:t>
+      </w:r>
+      <w:r>
+        <w:t xml:space="preserve"> </w:t>
+      </w:r>
+      <w:r>
+        <w:rPr>
+          <w:rStyle w:val="VerbatimChar"/>
+        </w:rPr>
+        <w:t xml:space="preserve">--scoring vina</w:t>
+      </w:r>
+      <w:r>
+        <w:t xml:space="preserve"> </w:t>
+      </w:r>
+      <w:r>
+        <w:rPr>
+          <w:rFonts w:hint="eastAsia"/>
+        </w:rPr>
+        <w:t xml:space="preserve">正常（§3.5</w:t>
+      </w:r>
+      <w:r>
+        <w:t xml:space="preserve"> </w:t>
+      </w:r>
+      <w:r>
+        <w:rPr>
+          <w:rFonts w:hint="eastAsia"/>
+        </w:rPr>
+        <w:t xml:space="preserve">的</w:t>
+      </w:r>
+      <w:r>
+        <w:t xml:space="preserve"> 1HVR/3PTB </w:t>
+      </w:r>
+      <w:r>
+        <w:rPr>
+          <w:rFonts w:hint="eastAsia"/>
+        </w:rPr>
+        <w:t xml:space="preserve">数值复现即经</w:t>
+      </w:r>
+      <w:r>
+        <w:t xml:space="preserve"> CLI </w:t>
+      </w:r>
+      <w:r>
+        <w:rPr>
+          <w:rFonts w:hint="eastAsia"/>
+        </w:rPr>
+        <w:t xml:space="preserve">完成）；本节所述</w:t>
+      </w:r>
+      <w:r>
+        <w:t xml:space="preserve"> SIGABRT </w:t>
+      </w:r>
+      <w:r>
+        <w:rPr>
+          <w:rFonts w:hint="eastAsia"/>
+        </w:rPr>
+        <w:t xml:space="preserve">限于上述</w:t>
+      </w:r>
+      <w:r>
+        <w:t xml:space="preserve"> GUI </w:t>
+      </w:r>
+      <w:r>
+        <w:rPr>
+          <w:rFonts w:hint="eastAsia"/>
+        </w:rPr>
+        <w:t xml:space="preserve">集成打包环境。</w:t>
       </w:r>
     </w:p>
     <w:bookmarkEnd w:id="28"/>
@@ -16452,6 +16814,122 @@
         </w:rPr>
         <w:t xml:space="preserve">的金属模式自动检测成为可退出行为。</w:t>
       </w:r>
+      <w:r>
+        <w:rPr>
+          <w:rFonts w:hint="eastAsia"/>
+          <w:b/>
+          <w:bCs/>
+        </w:rPr>
+        <w:t xml:space="preserve">注</w:t>
+      </w:r>
+      <w:r>
+        <w:rPr>
+          <w:rFonts w:hint="eastAsia"/>
+        </w:rPr>
+        <w:t xml:space="preserve">：上文中</w:t>
+      </w:r>
+      <w:r>
+        <w:t xml:space="preserve"> 3HS4 </w:t>
+      </w:r>
+      <w:r>
+        <w:rPr>
+          <w:rFonts w:hint="eastAsia"/>
+        </w:rPr>
+        <w:t xml:space="preserve">晶体姿态</w:t>
+      </w:r>
+      <w:r>
+        <w:t xml:space="preserve"> zn </w:t>
+      </w:r>
+      <w:r>
+        <w:rPr>
+          <w:rFonts w:hint="eastAsia"/>
+        </w:rPr>
+        <w:t xml:space="preserve">评分</w:t>
+      </w:r>
+      <w:r>
+        <w:t xml:space="preserve"> −11.3 kcal/mol </w:t>
+      </w:r>
+      <w:r>
+        <w:rPr>
+          <w:rFonts w:hint="eastAsia"/>
+        </w:rPr>
+        <w:t xml:space="preserve">是对晶体构象（</w:t>
+      </w:r>
+      <w:r>
+        <w:rPr>
+          <w:rStyle w:val="VerbatimChar"/>
+        </w:rPr>
+        <w:t xml:space="preserve">--score_only</w:t>
+      </w:r>
+      <w:r>
+        <w:rPr>
+          <w:rFonts w:hint="eastAsia"/>
+        </w:rPr>
+        <w:t xml:space="preserve">）的重打分；§3.7</w:t>
+      </w:r>
+      <w:r>
+        <w:t xml:space="preserve"> </w:t>
+      </w:r>
+      <w:r>
+        <w:rPr>
+          <w:rFonts w:hint="eastAsia"/>
+        </w:rPr>
+        <w:t xml:space="preserve">表</w:t>
+      </w:r>
+      <w:r>
+        <w:t xml:space="preserve"> 9 </w:t>
+      </w:r>
+      <w:r>
+        <w:rPr>
+          <w:rFonts w:hint="eastAsia"/>
+        </w:rPr>
+        <w:t xml:space="preserve">中</w:t>
+      </w:r>
+      <w:r>
+        <w:t xml:space="preserve"> 3HS4 AD4+zn </w:t>
+      </w:r>
+      <w:r>
+        <w:rPr>
+          <w:rFonts w:hint="eastAsia"/>
+        </w:rPr>
+        <w:t xml:space="preserve">全局对接最佳亲和力为</w:t>
+      </w:r>
+      <w:r>
+        <w:t xml:space="preserve"> −13.32 </w:t>
+      </w:r>
+      <w:r>
+        <w:rPr>
+          <w:rFonts w:hint="eastAsia"/>
+        </w:rPr>
+        <w:t xml:space="preserve">kcal/mol，两者因搜索自由度差异有所不同；两者与实验亲和力</w:t>
+      </w:r>
+      <w:r>
+        <w:t xml:space="preserve"> ≈−10.8 kcal/mol </w:t>
+      </w:r>
+      <w:r>
+        <w:rPr>
+          <w:rFonts w:hint="eastAsia"/>
+        </w:rPr>
+        <w:t xml:space="preserve">偏差均</w:t>
+      </w:r>
+      <w:r>
+        <w:t xml:space="preserve"> &lt;3 </w:t>
+      </w:r>
+      <w:r>
+        <w:rPr>
+          <w:rFonts w:hint="eastAsia"/>
+        </w:rPr>
+        <w:t xml:space="preserve">kcal/mol，符合</w:t>
+      </w:r>
+      <w:r>
+        <w:t xml:space="preserve"> AutoDock4Zn </w:t>
+      </w:r>
+      <w:r>
+        <w:rPr>
+          <w:rFonts w:hint="eastAsia"/>
+        </w:rPr>
+        <w:t xml:space="preserve">文献报告的精度水平。</w:t>
+      </w:r>
     </w:p>
     <w:bookmarkEnd w:id="42"/>
     <w:bookmarkStart w:id="49" w:name="功能族实测伪原子几何-bvs-水桥-金属作配体"/>
@@ -21376,7 +21854,49 @@
         <w:t xml:space="preserve">benchmarks/redock_benchmark/results/redock_{zn,fe,cu}_120.json</w:t>
       </w:r>
       <w:r>
-        <w:t xml:space="preserve">、</w:t>
+        <w:rPr>
+          <w:rFonts w:hint="eastAsia"/>
+        </w:rPr>
+        <w:t xml:space="preserve">——文件名中的</w:t>
+      </w:r>
+      <w:r>
+        <w:t xml:space="preserve"> 120 </w:t>
+      </w:r>
+      <w:r>
+        <w:rPr>
+          <w:rFonts w:hint="eastAsia"/>
+        </w:rPr>
+        <w:t xml:space="preserve">为</w:t>
+      </w:r>
+      <w:r>
+        <w:t xml:space="preserve"> RCSB </w:t>
+      </w:r>
+      <w:r>
+        <w:rPr>
+          <w:rFonts w:hint="eastAsia"/>
+        </w:rPr>
+        <w:t xml:space="preserve">检索候选池大小，筛选后实际重对接</w:t>
+      </w:r>
+      <w:r>
+        <w:t xml:space="preserve"> 104 </w:t>
+      </w:r>
+      <w:r>
+        <w:rPr>
+          <w:rFonts w:hint="eastAsia"/>
+        </w:rPr>
+        <w:t xml:space="preserve">个体系：Zn</w:t>
+      </w:r>
+      <w:r>
+        <w:t xml:space="preserve"> 22 / Fe 47 / Cu </w:t>
+      </w:r>
+      <w:r>
+        <w:rPr>
+          <w:rFonts w:hint="eastAsia"/>
+        </w:rPr>
+        <w:t xml:space="preserve">35；另有</w:t>
+      </w:r>
+      <w:r>
+        <w:t xml:space="preserve"> </w:t>
       </w:r>
       <w:r>
         <w:rPr>
@@ -21662,7 +22182,16 @@
         <w:t xml:space="preserve">三种评分函数（exhaustiveness</w:t>
       </w:r>
       <w:r>
-        <w:t xml:space="preserve"> 8、5 </w:t>
+        <w:t xml:space="preserve"> </w:t>
+      </w:r>
+      <w:r>
+        <w:rPr>
+          <w:rFonts w:hint="eastAsia"/>
+        </w:rPr>
+        <w:t xml:space="preserve">8、请求</w:t>
+      </w:r>
+      <w:r>
+        <w:t xml:space="preserve"> 5 </w:t>
       </w:r>
       <w:r>
         <w:rPr>
@@ -21758,7 +22287,43 @@
         <w:rPr>
           <w:rFonts w:hint="eastAsia"/>
         </w:rPr>
-        <w:t xml:space="preserve">AD4）：</w:t>
+        <w:t xml:space="preserve">AD4）；AD4</w:t>
+      </w:r>
+      <w:r>
+        <w:t xml:space="preserve"> </w:t>
+      </w:r>
+      <w:r>
+        <w:rPr>
+          <w:rFonts w:hint="eastAsia"/>
+        </w:rPr>
+        <w:t xml:space="preserve">评分下</w:t>
+      </w:r>
+      <w:r>
+        <w:t xml:space="preserve"> 4JC </w:t>
+      </w:r>
+      <w:r>
+        <w:rPr>
+          <w:rFonts w:hint="eastAsia"/>
+        </w:rPr>
+        <w:t xml:space="preserve">与</w:t>
+      </w:r>
+      <w:r>
+        <w:t xml:space="preserve"> 6OIM </w:t>
+      </w:r>
+      <w:r>
+        <w:rPr>
+          <w:rFonts w:hint="eastAsia"/>
+        </w:rPr>
+        <w:t xml:space="preserve">因能量范围截断实际输出</w:t>
+      </w:r>
+      <w:r>
+        <w:t xml:space="preserve"> 4 </w:t>
+      </w:r>
+      <w:r>
+        <w:rPr>
+          <w:rFonts w:hint="eastAsia"/>
+        </w:rPr>
+        <w:t xml:space="preserve">个模式：</w:t>
       </w:r>
     </w:p>
     <w:p>
@@ -23130,7 +23695,7 @@
       <w:r>
         <w:drawing>
           <wp:inline>
-            <wp:extent cx="5334000" cy="1748829"/>
+            <wp:extent cx="5334000" cy="1749752"/>
             <wp:effectExtent b="0" l="0" r="0" t="0"/>
             <wp:docPr descr="图 S5" title="" id="67" name="Picture"/>
             <a:graphic>
@@ -23151,7 +23716,7 @@
                   <pic:spPr bwMode="auto">
                     <a:xfrm>
                       <a:off x="0" y="0"/>
-                      <a:ext cx="5334000" cy="1748829"/>
+                      <a:ext cx="5334000" cy="1749752"/>
                     </a:xfrm>
                     <a:prstGeom prst="rect">
                       <a:avLst/>
@@ -23423,7 +23988,7 @@
       <w:r>
         <w:drawing>
           <wp:inline>
-            <wp:extent cx="5334000" cy="3413424"/>
+            <wp:extent cx="5334000" cy="3412530"/>
             <wp:effectExtent b="0" l="0" r="0" t="0"/>
             <wp:docPr descr="图 S7" title="" id="73" name="Picture"/>
             <a:graphic>
@@ -23444,7 +24009,7 @@
                   <pic:spPr bwMode="auto">
                     <a:xfrm>
                       <a:off x="0" y="0"/>
-                      <a:ext cx="5334000" cy="3413424"/>
+                      <a:ext cx="5334000" cy="3412530"/>
                     </a:xfrm>
                     <a:prstGeom prst="rect">
                       <a:avLst/>
@@ -28004,12 +28569,63 @@
             </w:pPr>
             <w:r>
               <w:rPr>
+                <w:rStyle w:val="VerbatimChar"/>
+              </w:rPr>
+              <w:t xml:space="preserve">AG4_EINTCLAMP</w:t>
+            </w:r>
+            <w:r>
+              <w:t xml:space="preserve"> </w:t>
+            </w:r>
+            <w:r>
+              <w:rPr>
                 <w:rFonts w:hint="eastAsia"/>
               </w:rPr>
-              <w:t xml:space="preserve">钳制</w:t>
-            </w:r>
-            <w:r>
-              <w:t xml:space="preserve"> 100000 → 1000 kcal/mol</w:t>
+              <w:t xml:space="preserve">对齐官方语义（成对</w:t>
+            </w:r>
+            <w:r>
+              <w:t xml:space="preserve"> LJ </w:t>
+            </w:r>
+            <w:r>
+              <w:rPr>
+                <w:rFonts w:hint="eastAsia"/>
+              </w:rPr>
+              <w:t xml:space="preserve">表上</w:t>
+            </w:r>
+            <w:r>
+              <w:t xml:space="preserve"> clamp </w:t>
+            </w:r>
+            <w:r>
+              <w:rPr>
+                <w:rFonts w:hint="eastAsia"/>
+              </w:rPr>
+              <w:t xml:space="preserve">100000；移除</w:t>
+            </w:r>
+            <w:r>
+              <w:t xml:space="preserve"> map </w:t>
+            </w:r>
+            <w:r>
+              <w:rPr>
+                <w:rFonts w:hint="eastAsia"/>
+              </w:rPr>
+              <w:t xml:space="preserve">总值</w:t>
+            </w:r>
+            <w:r>
+              <w:t xml:space="preserve"> ±1000 </w:t>
+            </w:r>
+            <w:r>
+              <w:rPr>
+                <w:rFonts w:hint="eastAsia"/>
+              </w:rPr>
+              <w:t xml:space="preserve">双向</w:t>
+            </w:r>
+            <w:r>
+              <w:t xml:space="preserve"> </w:t>
+            </w:r>
+            <w:r>
+              <w:rPr>
+                <w:rFonts w:hint="eastAsia"/>
+              </w:rPr>
+              <w:t xml:space="preserve">clamp）</w:t>
             </w:r>
           </w:p>
         </w:tc>
@@ -30550,16 +31166,55 @@
         <w:rPr>
           <w:rFonts w:hint="eastAsia"/>
         </w:rPr>
-        <w:t xml:space="preserve">，</w:t>
-      </w:r>
-      <w:r>
-        <w:t xml:space="preserve"> </w:t>
-      </w:r>
-      <w:r>
-        <w:rPr>
-          <w:rFonts w:hint="eastAsia"/>
-        </w:rPr>
-        <w:t xml:space="preserve">全部正文图与补充图生成脚本（300</w:t>
+        <w:t xml:space="preserve">与</w:t>
+      </w:r>
+      <w:r>
+        <w:t xml:space="preserve"> </w:t>
+      </w:r>
+      <w:r>
+        <w:rPr>
+          <w:rStyle w:val="VerbatimChar"/>
+        </w:rPr>
+        <w:t xml:space="preserve">benchmarks/make_supplementary_figures.py</w:t>
+      </w:r>
+      <w:r>
+        <w:rPr>
+          <w:rFonts w:hint="eastAsia"/>
+        </w:rPr>
+        <w:t xml:space="preserve">（含</w:t>
+      </w:r>
+      <w:r>
+        <w:t xml:space="preserve"> </w:t>
+      </w:r>
+      <w:r>
+        <w:rPr>
+          <w:rStyle w:val="VerbatimChar"/>
+        </w:rPr>
+        <w:t xml:space="preserve">make_figS3S4.py</w:t>
+      </w:r>
+      <w:r>
+        <w:t xml:space="preserve">、</w:t>
+      </w:r>
+      <w:r>
+        <w:rPr>
+          <w:rStyle w:val="VerbatimChar"/>
+        </w:rPr>
+        <w:t xml:space="preserve">make_redock_figures.py</w:t>
+      </w:r>
+      <w:r>
+        <w:t xml:space="preserve">、</w:t>
+      </w:r>
+      <w:r>
+        <w:rPr>
+          <w:rStyle w:val="VerbatimChar"/>
+        </w:rPr>
+        <w:t xml:space="preserve">make_graphical_abstract.py</w:t>
+      </w:r>
+      <w:r>
+        <w:rPr>
+          <w:rFonts w:hint="eastAsia"/>
+        </w:rPr>
+        <w:t xml:space="preserve">），全部正文图与补充图生成脚本（600</w:t>
       </w:r>
       <w:r>
         <w:t xml:space="preserve"> DPI PNG + </w:t>
@@ -30571,13 +31226,13 @@
         <w:t xml:space="preserve">矢量</w:t>
       </w:r>
       <w:r>
-        <w:t xml:space="preserve"> PDF </w:t>
-      </w:r>
-      <w:r>
-        <w:rPr>
-          <w:rFonts w:hint="eastAsia"/>
-        </w:rPr>
-        <w:t xml:space="preserve">双输出）。</w:t>
+        <w:t xml:space="preserve"> PDF + TIFF </w:t>
+      </w:r>
+      <w:r>
+        <w:rPr>
+          <w:rFonts w:hint="eastAsia"/>
+        </w:rPr>
+        <w:t xml:space="preserve">三格式）。</w:t>
       </w:r>
     </w:p>
     <w:p>

</xml_diff>